<commit_message>
Credit Card document updated
</commit_message>
<xml_diff>
--- a/CreditCard.docx
+++ b/CreditCard.docx
@@ -466,41 +466,17 @@
     </w:p>
     <w:p>
       <w:r>
-        <w:t xml:space="preserve">    CREDIT_LIMIT         </w:t>
-      </w:r>
-      <w:proofErr w:type="gramStart"/>
-      <w:r>
-        <w:t>NUMBER(</w:t>
-      </w:r>
-      <w:proofErr w:type="gramEnd"/>
-      <w:r>
-        <w:t>15,2) NOT NULL,</w:t>
-      </w:r>
-    </w:p>
-    <w:p>
-      <w:r>
-        <w:t xml:space="preserve">    AVAILABLE_CREDIT     </w:t>
-      </w:r>
-      <w:proofErr w:type="gramStart"/>
-      <w:r>
-        <w:t>NUMBER(</w:t>
-      </w:r>
-      <w:proofErr w:type="gramEnd"/>
-      <w:r>
-        <w:t>15,2) NOT NULL,</w:t>
-      </w:r>
-    </w:p>
-    <w:p>
-      <w:r>
-        <w:t xml:space="preserve">    OUTSTANDING_AMOUNT   </w:t>
-      </w:r>
-      <w:proofErr w:type="gramStart"/>
-      <w:r>
-        <w:t>NUMBER(</w:t>
-      </w:r>
-      <w:proofErr w:type="gramEnd"/>
-      <w:r>
-        <w:t>15,2) NOT NULL,</w:t>
+        <w:t xml:space="preserve">    CREDIT_LIMIT         NUMBER(15,2) NOT NULL,</w:t>
+      </w:r>
+    </w:p>
+    <w:p>
+      <w:r>
+        <w:t xml:space="preserve">    AVAILABLE_CREDIT     NUMBER(15,2) NOT NULL,</w:t>
+      </w:r>
+    </w:p>
+    <w:p>
+      <w:r>
+        <w:t xml:space="preserve">    OUTSTANDING_AMOUNT   NUMBER(15,2) NOT NULL,</w:t>
       </w:r>
     </w:p>
     <w:p>
@@ -703,41 +679,17 @@
     </w:p>
     <w:p>
       <w:r>
-        <w:t xml:space="preserve">    BILL_AMOUNT            </w:t>
-      </w:r>
-      <w:proofErr w:type="gramStart"/>
-      <w:r>
-        <w:t>NUMBER(</w:t>
-      </w:r>
-      <w:proofErr w:type="gramEnd"/>
-      <w:r>
-        <w:t>15,2) NOT NULL,</w:t>
-      </w:r>
-    </w:p>
-    <w:p>
-      <w:r>
-        <w:t xml:space="preserve">    PAID_AMOUNT            </w:t>
-      </w:r>
-      <w:proofErr w:type="gramStart"/>
-      <w:r>
-        <w:t>NUMBER(</w:t>
-      </w:r>
-      <w:proofErr w:type="gramEnd"/>
-      <w:r>
-        <w:t>15,2) DEFAULT 0 NOT NULL,</w:t>
-      </w:r>
-    </w:p>
-    <w:p>
-      <w:r>
-        <w:t xml:space="preserve">    OUTSTANDING_AMOUNT     </w:t>
-      </w:r>
-      <w:proofErr w:type="gramStart"/>
-      <w:r>
-        <w:t>NUMBER(</w:t>
-      </w:r>
-      <w:proofErr w:type="gramEnd"/>
-      <w:r>
-        <w:t>15,2) NOT NULL,</w:t>
+        <w:t xml:space="preserve">    BILL_AMOUNT            NUMBER(15,2) NOT NULL,</w:t>
+      </w:r>
+    </w:p>
+    <w:p>
+      <w:r>
+        <w:t xml:space="preserve">    PAID_AMOUNT            NUMBER(15,2) DEFAULT 0 NOT NULL,</w:t>
+      </w:r>
+    </w:p>
+    <w:p>
+      <w:r>
+        <w:t xml:space="preserve">    OUTSTANDING_AMOUNT     NUMBER(15,2) NOT NULL,</w:t>
       </w:r>
     </w:p>
     <w:p/>
@@ -848,15 +800,7 @@
     </w:p>
     <w:p>
       <w:r>
-        <w:t xml:space="preserve">    AMOUNT               </w:t>
-      </w:r>
-      <w:proofErr w:type="gramStart"/>
-      <w:r>
-        <w:t>NUMBER(</w:t>
-      </w:r>
-      <w:proofErr w:type="gramEnd"/>
-      <w:r>
-        <w:t>15,2) NOT NULL,</w:t>
+        <w:t xml:space="preserve">    AMOUNT               NUMBER(15,2) NOT NULL,</w:t>
       </w:r>
     </w:p>
     <w:p>
@@ -963,6 +907,9 @@
     <w:p/>
     <w:p>
       <w:r>
+        <w:rPr>
+          <w:noProof/>
+        </w:rPr>
         <w:lastRenderedPageBreak/>
         <w:drawing>
           <wp:inline distT="0" distB="0" distL="0" distR="0" wp14:anchorId="152051D5" wp14:editId="5F2B005A">
@@ -980,7 +927,7 @@
                     <pic:cNvPicPr/>
                   </pic:nvPicPr>
                   <pic:blipFill>
-                    <a:blip r:embed="rId10"/>
+                    <a:blip r:embed="rId9"/>
                     <a:stretch>
                       <a:fillRect/>
                     </a:stretch>
@@ -1003,6 +950,9 @@
     </w:p>
     <w:p>
       <w:r>
+        <w:rPr>
+          <w:noProof/>
+        </w:rPr>
         <w:drawing>
           <wp:inline distT="0" distB="0" distL="0" distR="0" wp14:anchorId="76C1C569" wp14:editId="32F45C96">
             <wp:extent cx="5731510" cy="2666365"/>
@@ -1019,7 +969,7 @@
                     <pic:cNvPicPr/>
                   </pic:nvPicPr>
                   <pic:blipFill>
-                    <a:blip r:embed="rId11"/>
+                    <a:blip r:embed="rId10"/>
                     <a:stretch>
                       <a:fillRect/>
                     </a:stretch>
@@ -1042,6 +992,9 @@
     </w:p>
     <w:p>
       <w:r>
+        <w:rPr>
+          <w:noProof/>
+        </w:rPr>
         <w:lastRenderedPageBreak/>
         <w:drawing>
           <wp:inline distT="0" distB="0" distL="0" distR="0" wp14:anchorId="3F9C2F80" wp14:editId="462BD96C">
@@ -1059,7 +1012,7 @@
                     <pic:cNvPicPr/>
                   </pic:nvPicPr>
                   <pic:blipFill>
-                    <a:blip r:embed="rId12"/>
+                    <a:blip r:embed="rId11"/>
                     <a:stretch>
                       <a:fillRect/>
                     </a:stretch>
@@ -1082,6 +1035,9 @@
     </w:p>
     <w:p>
       <w:r>
+        <w:rPr>
+          <w:noProof/>
+        </w:rPr>
         <w:drawing>
           <wp:inline distT="0" distB="0" distL="0" distR="0" wp14:anchorId="517D6956" wp14:editId="16EC8FB6">
             <wp:extent cx="5731510" cy="1805305"/>
@@ -1098,7 +1054,7 @@
                     <pic:cNvPicPr/>
                   </pic:nvPicPr>
                   <pic:blipFill>
-                    <a:blip r:embed="rId13"/>
+                    <a:blip r:embed="rId12"/>
                     <a:stretch>
                       <a:fillRect/>
                     </a:stretch>
@@ -1122,6 +1078,9 @@
     <w:p/>
     <w:p>
       <w:r>
+        <w:rPr>
+          <w:noProof/>
+        </w:rPr>
         <w:drawing>
           <wp:inline distT="0" distB="0" distL="0" distR="0" wp14:anchorId="333FA2E3" wp14:editId="0DEF5550">
             <wp:extent cx="5731510" cy="3225800"/>
@@ -1138,7 +1097,7 @@
                     <pic:cNvPicPr/>
                   </pic:nvPicPr>
                   <pic:blipFill>
-                    <a:blip r:embed="rId14"/>
+                    <a:blip r:embed="rId13"/>
                     <a:stretch>
                       <a:fillRect/>
                     </a:stretch>
@@ -1161,6 +1120,9 @@
     </w:p>
     <w:p>
       <w:r>
+        <w:rPr>
+          <w:noProof/>
+        </w:rPr>
         <w:lastRenderedPageBreak/>
         <w:drawing>
           <wp:inline distT="0" distB="0" distL="0" distR="0" wp14:anchorId="4F3DA7C7" wp14:editId="01591E17">
@@ -1178,7 +1140,7 @@
                     <pic:cNvPicPr/>
                   </pic:nvPicPr>
                   <pic:blipFill>
-                    <a:blip r:embed="rId15"/>
+                    <a:blip r:embed="rId14"/>
                     <a:stretch>
                       <a:fillRect/>
                     </a:stretch>
@@ -1201,6 +1163,9 @@
     </w:p>
     <w:p>
       <w:r>
+        <w:rPr>
+          <w:noProof/>
+        </w:rPr>
         <w:drawing>
           <wp:inline distT="0" distB="0" distL="0" distR="0" wp14:anchorId="3E76AD84" wp14:editId="1FCA12A3">
             <wp:extent cx="5731510" cy="3991610"/>
@@ -1217,7 +1182,7 @@
                     <pic:cNvPicPr/>
                   </pic:nvPicPr>
                   <pic:blipFill>
-                    <a:blip r:embed="rId16"/>
+                    <a:blip r:embed="rId15"/>
                     <a:stretch>
                       <a:fillRect/>
                     </a:stretch>
@@ -1240,6 +1205,9 @@
     </w:p>
     <w:p>
       <w:r>
+        <w:rPr>
+          <w:noProof/>
+        </w:rPr>
         <w:lastRenderedPageBreak/>
         <w:drawing>
           <wp:inline distT="0" distB="0" distL="0" distR="0" wp14:anchorId="415191C4" wp14:editId="32157A68">
@@ -1257,7 +1225,7 @@
                     <pic:cNvPicPr/>
                   </pic:nvPicPr>
                   <pic:blipFill>
-                    <a:blip r:embed="rId17"/>
+                    <a:blip r:embed="rId16"/>
                     <a:stretch>
                       <a:fillRect/>
                     </a:stretch>
@@ -1281,6 +1249,9 @@
     <w:p/>
     <w:p>
       <w:r>
+        <w:rPr>
+          <w:noProof/>
+        </w:rPr>
         <w:drawing>
           <wp:inline distT="0" distB="0" distL="0" distR="0" wp14:anchorId="595EAFCB" wp14:editId="4DF7628C">
             <wp:extent cx="5731510" cy="2691765"/>
@@ -1297,7 +1268,7 @@
                     <pic:cNvPicPr/>
                   </pic:nvPicPr>
                   <pic:blipFill>
-                    <a:blip r:embed="rId18"/>
+                    <a:blip r:embed="rId17"/>
                     <a:stretch>
                       <a:fillRect/>
                     </a:stretch>
@@ -1320,6 +1291,9 @@
     </w:p>
     <w:p>
       <w:r>
+        <w:rPr>
+          <w:noProof/>
+        </w:rPr>
         <w:drawing>
           <wp:inline distT="0" distB="0" distL="0" distR="0" wp14:anchorId="59B6DD6E" wp14:editId="0C5D9C77">
             <wp:extent cx="5731510" cy="1941195"/>
@@ -1336,7 +1310,7 @@
                     <pic:cNvPicPr/>
                   </pic:nvPicPr>
                   <pic:blipFill>
-                    <a:blip r:embed="rId19"/>
+                    <a:blip r:embed="rId18"/>
                     <a:stretch>
                       <a:fillRect/>
                     </a:stretch>
@@ -1359,6 +1333,9 @@
     </w:p>
     <w:p>
       <w:r>
+        <w:rPr>
+          <w:noProof/>
+        </w:rPr>
         <w:lastRenderedPageBreak/>
         <w:drawing>
           <wp:inline distT="0" distB="0" distL="0" distR="0" wp14:anchorId="24F01B85" wp14:editId="7134E8C7">
@@ -1376,7 +1353,7 @@
                     <pic:cNvPicPr/>
                   </pic:nvPicPr>
                   <pic:blipFill>
-                    <a:blip r:embed="rId20"/>
+                    <a:blip r:embed="rId19"/>
                     <a:stretch>
                       <a:fillRect/>
                     </a:stretch>
@@ -1400,6 +1377,9 @@
     <w:p/>
     <w:p>
       <w:r>
+        <w:rPr>
+          <w:noProof/>
+        </w:rPr>
         <w:drawing>
           <wp:inline distT="0" distB="0" distL="0" distR="0" wp14:anchorId="2888055B" wp14:editId="572043AC">
             <wp:extent cx="5731510" cy="3970655"/>
@@ -1416,7 +1396,7 @@
                     <pic:cNvPicPr/>
                   </pic:nvPicPr>
                   <pic:blipFill>
-                    <a:blip r:embed="rId21"/>
+                    <a:blip r:embed="rId20"/>
                     <a:stretch>
                       <a:fillRect/>
                     </a:stretch>
@@ -1439,6 +1419,9 @@
     </w:p>
     <w:p>
       <w:r>
+        <w:rPr>
+          <w:noProof/>
+        </w:rPr>
         <w:lastRenderedPageBreak/>
         <w:drawing>
           <wp:inline distT="0" distB="0" distL="0" distR="0" wp14:anchorId="75BF0FA4" wp14:editId="22F69600">
@@ -1456,7 +1439,7 @@
                     <pic:cNvPicPr/>
                   </pic:nvPicPr>
                   <pic:blipFill>
-                    <a:blip r:embed="rId22"/>
+                    <a:blip r:embed="rId21"/>
                     <a:stretch>
                       <a:fillRect/>
                     </a:stretch>
@@ -1479,6 +1462,9 @@
     </w:p>
     <w:p>
       <w:r>
+        <w:rPr>
+          <w:noProof/>
+        </w:rPr>
         <w:drawing>
           <wp:inline distT="0" distB="0" distL="0" distR="0" wp14:anchorId="5721C7B3" wp14:editId="068B75F6">
             <wp:extent cx="5731510" cy="3964305"/>
@@ -1495,7 +1481,7 @@
                     <pic:cNvPicPr/>
                   </pic:nvPicPr>
                   <pic:blipFill>
-                    <a:blip r:embed="rId23"/>
+                    <a:blip r:embed="rId22"/>
                     <a:stretch>
                       <a:fillRect/>
                     </a:stretch>
@@ -1518,6 +1504,9 @@
     </w:p>
     <w:p>
       <w:r>
+        <w:rPr>
+          <w:noProof/>
+        </w:rPr>
         <w:lastRenderedPageBreak/>
         <w:drawing>
           <wp:inline distT="0" distB="0" distL="0" distR="0" wp14:anchorId="4A560839" wp14:editId="76B1350B">
@@ -1535,7 +1524,7 @@
                     <pic:cNvPicPr/>
                   </pic:nvPicPr>
                   <pic:blipFill>
-                    <a:blip r:embed="rId24"/>
+                    <a:blip r:embed="rId23"/>
                     <a:stretch>
                       <a:fillRect/>
                     </a:stretch>
@@ -1556,13 +1545,143 @@
         </w:drawing>
       </w:r>
     </w:p>
+    <w:p/>
+    <w:p>
+      <w:r>
+        <w:drawing>
+          <wp:inline distT="0" distB="0" distL="0" distR="0" wp14:anchorId="24FB5046" wp14:editId="72796C41">
+            <wp:extent cx="5731510" cy="3753485"/>
+            <wp:effectExtent l="0" t="0" r="2540" b="0"/>
+            <wp:docPr id="154232710" name="Picture 1"/>
+            <wp:cNvGraphicFramePr>
+              <a:graphicFrameLocks xmlns:a="http://schemas.openxmlformats.org/drawingml/2006/main" noChangeAspect="1"/>
+            </wp:cNvGraphicFramePr>
+            <a:graphic xmlns:a="http://schemas.openxmlformats.org/drawingml/2006/main">
+              <a:graphicData uri="http://schemas.openxmlformats.org/drawingml/2006/picture">
+                <pic:pic xmlns:pic="http://schemas.openxmlformats.org/drawingml/2006/picture">
+                  <pic:nvPicPr>
+                    <pic:cNvPr id="154232710" name=""/>
+                    <pic:cNvPicPr/>
+                  </pic:nvPicPr>
+                  <pic:blipFill>
+                    <a:blip r:embed="rId24"/>
+                    <a:stretch>
+                      <a:fillRect/>
+                    </a:stretch>
+                  </pic:blipFill>
+                  <pic:spPr>
+                    <a:xfrm>
+                      <a:off x="0" y="0"/>
+                      <a:ext cx="5731510" cy="3753485"/>
+                    </a:xfrm>
+                    <a:prstGeom prst="rect">
+                      <a:avLst/>
+                    </a:prstGeom>
+                  </pic:spPr>
+                </pic:pic>
+              </a:graphicData>
+            </a:graphic>
+          </wp:inline>
+        </w:drawing>
+      </w:r>
+    </w:p>
+    <w:p>
+      <w:r>
+        <w:drawing>
+          <wp:inline distT="0" distB="0" distL="0" distR="0" wp14:anchorId="760B4D52" wp14:editId="4CA56075">
+            <wp:extent cx="5731510" cy="1384935"/>
+            <wp:effectExtent l="0" t="0" r="2540" b="5715"/>
+            <wp:docPr id="1190373655" name="Picture 1"/>
+            <wp:cNvGraphicFramePr>
+              <a:graphicFrameLocks xmlns:a="http://schemas.openxmlformats.org/drawingml/2006/main" noChangeAspect="1"/>
+            </wp:cNvGraphicFramePr>
+            <a:graphic xmlns:a="http://schemas.openxmlformats.org/drawingml/2006/main">
+              <a:graphicData uri="http://schemas.openxmlformats.org/drawingml/2006/picture">
+                <pic:pic xmlns:pic="http://schemas.openxmlformats.org/drawingml/2006/picture">
+                  <pic:nvPicPr>
+                    <pic:cNvPr id="1190373655" name=""/>
+                    <pic:cNvPicPr/>
+                  </pic:nvPicPr>
+                  <pic:blipFill>
+                    <a:blip r:embed="rId25"/>
+                    <a:stretch>
+                      <a:fillRect/>
+                    </a:stretch>
+                  </pic:blipFill>
+                  <pic:spPr>
+                    <a:xfrm>
+                      <a:off x="0" y="0"/>
+                      <a:ext cx="5731510" cy="1384935"/>
+                    </a:xfrm>
+                    <a:prstGeom prst="rect">
+                      <a:avLst/>
+                    </a:prstGeom>
+                  </pic:spPr>
+                </pic:pic>
+              </a:graphicData>
+            </a:graphic>
+          </wp:inline>
+        </w:drawing>
+      </w:r>
+    </w:p>
+    <w:p/>
+    <w:p>
+      <w:r>
+        <w:t>The application stack in each service can follow the layered structure specified by the case study:</w:t>
+      </w:r>
+    </w:p>
+    <w:p>
+      <w:r>
+        <w:t>Controller</w:t>
+      </w:r>
+    </w:p>
+    <w:p>
+      <w:r>
+        <w:t xml:space="preserve">    |</w:t>
+      </w:r>
+    </w:p>
+    <w:p>
+      <w:r>
+        <w:t>Service</w:t>
+      </w:r>
+    </w:p>
+    <w:p>
+      <w:r>
+        <w:t xml:space="preserve">    |</w:t>
+      </w:r>
+    </w:p>
+    <w:p>
+      <w:r>
+        <w:t>Repository</w:t>
+      </w:r>
+    </w:p>
+    <w:p>
+      <w:r>
+        <w:t xml:space="preserve">    |</w:t>
+      </w:r>
+    </w:p>
+    <w:p>
+      <w:r>
+        <w:t>Entity</w:t>
+      </w:r>
+    </w:p>
+    <w:p>
+      <w:r>
+        <w:t xml:space="preserve">    |</w:t>
+      </w:r>
+    </w:p>
+    <w:p>
+      <w:r>
+        <w:t>Oracle</w:t>
+      </w:r>
+    </w:p>
     <w:sectPr>
-      <w:headerReference w:type="even" r:id="rId25"/>
-      <w:headerReference w:type="default" r:id="rId26"/>
-      <w:footerReference w:type="even" r:id="rId27"/>
-      <w:footerReference w:type="default" r:id="rId28"/>
-      <w:headerReference w:type="first" r:id="rId29"/>
-      <w:footerReference w:type="first" r:id="rId30"/>
+      <w:headerReference w:type="even" r:id="rId26"/>
+      <w:headerReference w:type="default" r:id="rId27"/>
+      <w:footerReference w:type="even" r:id="rId28"/>
+      <w:footerReference w:type="default" r:id="rId29"/>
+      <w:headerReference w:type="first" r:id="rId30"/>
+      <w:footerReference w:type="first" r:id="rId31"/>
       <w:pgSz w:w="11906" w:h="16838"/>
       <w:pgMar w:top="1440" w:right="1440" w:bottom="1440" w:left="1440" w:header="708" w:footer="708" w:gutter="0"/>
       <w:cols w:space="708"/>
@@ -1691,7 +1810,6 @@
               <v:path gradientshapeok="t" o:connecttype="rect"/>
             </v:shapetype>
             <v:shape id="Text Box 5" o:spid="_x0000_s1028" type="#_x0000_t202" alt="Confidential - Oracle Restricted \Employees Only" style="position:absolute;margin-left:0;margin-top:0;width:230.75pt;height:29.15pt;z-index:251658244;visibility:visible;mso-wrap-style:none;mso-wrap-distance-left:0;mso-wrap-distance-top:0;mso-wrap-distance-right:0;mso-wrap-distance-bottom:0;mso-position-horizontal:left;mso-position-horizontal-relative:page;mso-position-vertical:bottom;mso-position-vertical-relative:page;v-text-anchor:bottom" o:gfxdata="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" filled="f" stroked="f">
-              <v:fill o:detectmouseclick="t"/>
               <v:textbox style="mso-fit-shape-to-text:t" inset="20pt,0,0,15pt">
                 <w:txbxContent>
                   <w:p>
@@ -1822,7 +1940,6 @@
               <v:path gradientshapeok="t" o:connecttype="rect"/>
             </v:shapetype>
             <v:shape id="Text Box 6" o:spid="_x0000_s1029" type="#_x0000_t202" alt="Confidential - Oracle Restricted \Employees Only" style="position:absolute;margin-left:0;margin-top:0;width:230.75pt;height:29.15pt;z-index:251658245;visibility:visible;mso-wrap-style:none;mso-wrap-distance-left:0;mso-wrap-distance-top:0;mso-wrap-distance-right:0;mso-wrap-distance-bottom:0;mso-position-horizontal:left;mso-position-horizontal-relative:page;mso-position-vertical:bottom;mso-position-vertical-relative:page;v-text-anchor:bottom" o:gfxdata="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" filled="f" stroked="f">
-              <v:fill o:detectmouseclick="t"/>
               <v:textbox style="mso-fit-shape-to-text:t" inset="20pt,0,0,15pt">
                 <w:txbxContent>
                   <w:p>
@@ -1953,7 +2070,6 @@
               <v:path gradientshapeok="t" o:connecttype="rect"/>
             </v:shapetype>
             <v:shape id="Text Box 4" o:spid="_x0000_s1031" type="#_x0000_t202" alt="Confidential - Oracle Restricted \Employees Only" style="position:absolute;margin-left:0;margin-top:0;width:230.75pt;height:29.15pt;z-index:251658243;visibility:visible;mso-wrap-style:none;mso-wrap-distance-left:0;mso-wrap-distance-top:0;mso-wrap-distance-right:0;mso-wrap-distance-bottom:0;mso-position-horizontal:left;mso-position-horizontal-relative:page;mso-position-vertical:bottom;mso-position-vertical-relative:page;v-text-anchor:bottom" o:gfxdata="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" filled="f" stroked="f">
-              <v:fill o:detectmouseclick="t"/>
               <v:textbox style="mso-fit-shape-to-text:t" inset="20pt,0,0,15pt">
                 <w:txbxContent>
                   <w:p>
@@ -2109,7 +2225,6 @@
               <v:path gradientshapeok="t" o:connecttype="rect"/>
             </v:shapetype>
             <v:shape id="Text Box 2" o:spid="_x0000_s1026" type="#_x0000_t202" alt="Confidential - Oracle Restricted \Employees Only" style="position:absolute;margin-left:0;margin-top:0;width:230.75pt;height:29.15pt;z-index:251658241;visibility:visible;mso-wrap-style:none;mso-wrap-distance-left:0;mso-wrap-distance-top:0;mso-wrap-distance-right:0;mso-wrap-distance-bottom:0;mso-position-horizontal:left;mso-position-horizontal-relative:page;mso-position-vertical:top;mso-position-vertical-relative:page;v-text-anchor:top" o:gfxdata="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" filled="f" stroked="f">
-              <v:fill o:detectmouseclick="t"/>
               <v:textbox style="mso-fit-shape-to-text:t" inset="20pt,15pt,0,0">
                 <w:txbxContent>
                   <w:p>
@@ -2240,7 +2355,6 @@
               <v:path gradientshapeok="t" o:connecttype="rect"/>
             </v:shapetype>
             <v:shape id="Text Box 3" o:spid="_x0000_s1027" type="#_x0000_t202" alt="Confidential - Oracle Restricted \Employees Only" style="position:absolute;margin-left:0;margin-top:0;width:230.75pt;height:29.15pt;z-index:251658242;visibility:visible;mso-wrap-style:none;mso-wrap-distance-left:0;mso-wrap-distance-top:0;mso-wrap-distance-right:0;mso-wrap-distance-bottom:0;mso-position-horizontal:left;mso-position-horizontal-relative:page;mso-position-vertical:top;mso-position-vertical-relative:page;v-text-anchor:top" o:gfxdata="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" filled="f" stroked="f">
-              <v:fill o:detectmouseclick="t"/>
               <v:textbox style="mso-fit-shape-to-text:t" inset="20pt,15pt,0,0">
                 <w:txbxContent>
                   <w:p>
@@ -2371,7 +2485,6 @@
               <v:path gradientshapeok="t" o:connecttype="rect"/>
             </v:shapetype>
             <v:shape id="Text Box 1" o:spid="_x0000_s1030" type="#_x0000_t202" alt="Confidential - Oracle Restricted \Employees Only" style="position:absolute;margin-left:0;margin-top:0;width:230.75pt;height:29.15pt;z-index:251658240;visibility:visible;mso-wrap-style:none;mso-wrap-distance-left:0;mso-wrap-distance-top:0;mso-wrap-distance-right:0;mso-wrap-distance-bottom:0;mso-position-horizontal:left;mso-position-horizontal-relative:page;mso-position-vertical:top;mso-position-vertical-relative:page;v-text-anchor:top" o:gfxdata="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" filled="f" stroked="f">
-              <v:fill o:detectmouseclick="t"/>
               <v:textbox style="mso-fit-shape-to-text:t" inset="20pt,15pt,0,0">
                 <w:txbxContent>
                   <w:p>
@@ -2406,10 +2519,6 @@
     </w:r>
   </w:p>
 </w:hdr>
-</file>
-
-<file path=word/numbering.xml><?xml version="1.0" encoding="utf-8"?>
-<w:numbering xmlns:wpc="http://schemas.microsoft.com/office/word/2010/wordprocessingCanvas" xmlns:cx="http://schemas.microsoft.com/office/drawing/2014/chartex" xmlns:cx1="http://schemas.microsoft.com/office/drawing/2015/9/8/chartex" xmlns:cx2="http://schemas.microsoft.com/office/drawing/2015/10/21/chartex" xmlns:cx3="http://schemas.microsoft.com/office/drawing/2016/5/9/chartex" xmlns:cx4="http://schemas.microsoft.com/office/drawing/2016/5/10/chartex" xmlns:cx5="http://schemas.microsoft.com/office/drawing/2016/5/11/chartex" xmlns:cx6="http://schemas.microsoft.com/office/drawing/2016/5/12/chartex" xmlns:cx7="http://schemas.microsoft.com/office/drawing/2016/5/13/chartex" xmlns:cx8="http://schemas.microsoft.com/office/drawing/2016/5/14/chartex" xmlns:mc="http://schemas.openxmlformats.org/markup-compatibility/2006" xmlns:aink="http://schemas.microsoft.com/office/drawing/2016/ink" xmlns:am3d="http://schemas.microsoft.com/office/drawing/2017/model3d" xmlns:o="urn:schemas-microsoft-com:office:office" xmlns:oel="http://schemas.microsoft.com/office/2019/extlst" xmlns:r="http://schemas.openxmlformats.org/officeDocument/2006/relationships" xmlns:m="http://schemas.openxmlformats.org/officeDocument/2006/math" xmlns:v="urn:schemas-microsoft-com:vml" xmlns:wp14="http://schemas.microsoft.com/office/word/2010/wordprocessingDrawing" xmlns:wp="http://schemas.openxmlformats.org/drawingml/2006/wordprocessingDrawing" xmlns:w10="urn:schemas-microsoft-com:office:word" xmlns:w="http://schemas.openxmlformats.org/wordprocessingml/2006/main" xmlns:w14="http://schemas.microsoft.com/office/word/2010/wordml" xmlns:w15="http://schemas.microsoft.com/office/word/2012/wordml" xmlns:w16cex="http://schemas.microsoft.com/office/word/2018/wordml/cex" xmlns:w16cid="http://schemas.microsoft.com/office/word/2016/wordml/cid" xmlns:w16="http://schemas.microsoft.com/office/word/2018/wordml" xmlns:w16du="http://schemas.microsoft.com/office/word/2023/wordml/word16du" xmlns:w16sdtdh="http://schemas.microsoft.com/office/word/2020/wordml/sdtdatahash" xmlns:w16sdtfl="http://schemas.microsoft.com/office/word/2024/wordml/sdtformatlock" xmlns:w16se="http://schemas.microsoft.com/office/word/2015/wordml/symex" xmlns:wpg="http://schemas.microsoft.com/office/word/2010/wordprocessingGroup" xmlns:wpi="http://schemas.microsoft.com/office/word/2010/wordprocessingInk" xmlns:wne="http://schemas.microsoft.com/office/word/2006/wordml" xmlns:wps="http://schemas.microsoft.com/office/word/2010/wordprocessingShape" mc:Ignorable="w14 w15 w16se w16cid w16 w16cex w16sdtdh w16sdtfl w16du wp14"/>
 </file>
 
 <file path=word/styles.xml><?xml version="1.0" encoding="utf-8"?>
@@ -3015,7 +3124,6 @@
   <w:style w:type="character" w:default="1" w:styleId="DefaultParagraphFont">
     <w:name w:val="Default Paragraph Font"/>
     <w:uiPriority w:val="1"/>
-    <w:semiHidden/>
     <w:unhideWhenUsed/>
   </w:style>
   <w:style w:type="table" w:default="1" w:styleId="TableNormal">
@@ -3703,6 +3811,15 @@
 </file>
 
 <file path=customXml/item1.xml><?xml version="1.0" encoding="utf-8"?>
+<?mso-contentType ?>
+<FormTemplates xmlns="http://schemas.microsoft.com/sharepoint/v3/contenttype/forms">
+  <Display>DocumentLibraryForm</Display>
+  <Edit>DocumentLibraryForm</Edit>
+  <New>DocumentLibraryForm</New>
+</FormTemplates>
+</file>
+
+<file path=customXml/item2.xml><?xml version="1.0" encoding="utf-8"?>
 <ct:contentTypeSchema xmlns:ct="http://schemas.microsoft.com/office/2006/metadata/contentType" xmlns:ma="http://schemas.microsoft.com/office/2006/metadata/properties/metaAttributes" ct:_="" ma:_="" ma:contentTypeName="Document" ma:contentTypeID="0x010100F81D3FBBF6C8944F83524BF205906B36" ma:contentTypeVersion="10" ma:contentTypeDescription="Create a new document." ma:contentTypeScope="" ma:versionID="5b03a418a6728b787ebc630e5bffcc3d">
   <xsd:schema xmlns:xsd="http://www.w3.org/2001/XMLSchema" xmlns:xs="http://www.w3.org/2001/XMLSchema" xmlns:p="http://schemas.microsoft.com/office/2006/metadata/properties" xmlns:ns3="a723fa26-6072-482b-a268-410e463175e5" targetNamespace="http://schemas.microsoft.com/office/2006/metadata/properties" ma:root="true" ma:fieldsID="c082812b3e4f2b3ee0f6de4f69034f19" ns3:_="">
     <xsd:import namespace="a723fa26-6072-482b-a268-410e463175e5"/>
@@ -3882,15 +3999,6 @@
 </ct:contentTypeSchema>
 </file>
 
-<file path=customXml/item2.xml><?xml version="1.0" encoding="utf-8"?>
-<?mso-contentType ?>
-<FormTemplates xmlns="http://schemas.microsoft.com/sharepoint/v3/contenttype/forms">
-  <Display>DocumentLibraryForm</Display>
-  <Edit>DocumentLibraryForm</Edit>
-  <New>DocumentLibraryForm</New>
-</FormTemplates>
-</file>
-
 <file path=customXml/item3.xml><?xml version="1.0" encoding="utf-8"?>
 <p:properties xmlns:p="http://schemas.microsoft.com/office/2006/metadata/properties" xmlns:xsi="http://www.w3.org/2001/XMLSchema-instance" xmlns:pc="http://schemas.microsoft.com/office/infopath/2007/PartnerControls">
   <documentManagement>
@@ -3900,6 +4008,14 @@
 </file>
 
 <file path=customXml/itemProps1.xml><?xml version="1.0" encoding="utf-8"?>
+<ds:datastoreItem xmlns:ds="http://schemas.openxmlformats.org/officeDocument/2006/customXml" ds:itemID="{BD1A1EA9-10ED-487E-B7DD-FC8893F080CA}">
+  <ds:schemaRefs>
+    <ds:schemaRef ds:uri="http://schemas.microsoft.com/sharepoint/v3/contenttype/forms"/>
+  </ds:schemaRefs>
+</ds:datastoreItem>
+</file>
+
+<file path=customXml/itemProps2.xml><?xml version="1.0" encoding="utf-8"?>
 <ds:datastoreItem xmlns:ds="http://schemas.openxmlformats.org/officeDocument/2006/customXml" ds:itemID="{A55B1A64-2958-4E5A-8C9B-D901E3E07F7F}">
   <ds:schemaRefs>
     <ds:schemaRef ds:uri="http://schemas.microsoft.com/office/2006/metadata/contentType"/>
@@ -3913,14 +4029,6 @@
     <ds:schemaRef ds:uri="http://purl.org/dc/elements/1.1/"/>
     <ds:schemaRef ds:uri="http://purl.org/dc/terms/"/>
     <ds:schemaRef ds:uri="http://schemas.microsoft.com/internal/obd"/>
-  </ds:schemaRefs>
-</ds:datastoreItem>
-</file>
-
-<file path=customXml/itemProps2.xml><?xml version="1.0" encoding="utf-8"?>
-<ds:datastoreItem xmlns:ds="http://schemas.openxmlformats.org/officeDocument/2006/customXml" ds:itemID="{BD1A1EA9-10ED-487E-B7DD-FC8893F080CA}">
-  <ds:schemaRefs>
-    <ds:schemaRef ds:uri="http://schemas.microsoft.com/sharepoint/v3/contenttype/forms"/>
   </ds:schemaRefs>
 </ds:datastoreItem>
 </file>

</xml_diff>